<commit_message>
andy sync: PC 2026-10-26 02:00:08
</commit_message>
<xml_diff>
--- a/Software Engineering 1/PAMESA - Proposal Letter VM Daet Construction.docx
+++ b/Software Engineering 1/PAMESA - Proposal Letter VM Daet Construction.docx
@@ -144,7 +144,7 @@
           <w:b/>
           <w:sz w:val="24"/>
         </w:rPr>
-        <w:t>Subject:  Thesis Partnership Proposal on Construction Material Demand Forecasting</w:t>
+        <w:t>Subject:  Thesis Partnership Proposal: Solving a Practical Problem Using the Company's Records</w:t>
       </w:r>
     </w:p>
     <w:p>
@@ -218,7 +218,7 @@
           <w:rFonts w:ascii="Times New Roman" w:eastAsia="Times New Roman" w:hAnsi="Times New Roman"/>
           <w:sz w:val="24"/>
         </w:rPr>
-        <w:t>We would like to invite your company to be that client. Our proposal is to use the records your company already keeps to forecast how much of each construction material will be needed in the coming weeks and months, so that purchasing and stock planning can be done with more confidence and fewer last-minute orders. We would build the forecasting tool and hand it over to you at no cost.</w:t>
+        <w:t>We would like to invite your company to be that client. Our proposal is to begin with a short conversation about the problems your company faces in its daily work, such as planning how much material to buy, estimating project costs, or avoiding delays in project schedules. We would then choose one problem that your company's own records can help answer, and build a tool for it. We would hand the tool over to you at no cost.</w:t>
       </w:r>
     </w:p>
     <w:p>
@@ -231,7 +231,7 @@
           <w:rFonts w:ascii="Times New Roman" w:eastAsia="Times New Roman" w:hAnsi="Times New Roman"/>
           <w:sz w:val="24"/>
         </w:rPr>
-        <w:t>We do not yet know exactly what records your company keeps, so we would like to adjust the study to what is available. If the records of materials are not suitable, the same approach can be used to estimate project costs or to study delays in project schedules. We would rather begin with your view of what would be most useful to the company.</w:t>
+        <w:t>We do not yet know which problem matters most to the company or what records you keep, so we would like to adjust the study to your needs and to what is available. We would rather begin with your view of what would be most useful.</w:t>
       </w:r>
     </w:p>
     <w:p>
@@ -245,7 +245,7 @@
           <w:rFonts w:ascii="Times New Roman" w:eastAsia="Times New Roman" w:hAnsi="Times New Roman"/>
           <w:sz w:val="24"/>
         </w:rPr>
-        <w:t>So that you can see what the study would involve, these are the records that would help us most.</w:t>
+        <w:t>So that you can see what the study would involve, these are the records that would help us most, depending on the problem we choose together.</w:t>
       </w:r>
     </w:p>
     <w:p>
@@ -324,7 +324,7 @@
           <w:rFonts w:ascii="Times New Roman" w:eastAsia="Times New Roman" w:hAnsi="Times New Roman"/>
           <w:sz w:val="24"/>
         </w:rPr>
-        <w:t>Stock counts, and price lists or quotations over time, if they are kept.</w:t>
+        <w:t>Stock counts, and price lists or quotations over time, if they are kept, and any other records related to the problem you would like solved.</w:t>
       </w:r>
     </w:p>
     <w:p>
@@ -363,7 +363,7 @@
           <w:rFonts w:ascii="Times New Roman" w:eastAsia="Times New Roman" w:hAnsi="Times New Roman"/>
           <w:sz w:val="24"/>
         </w:rPr>
-        <w:t>If the study proves useful, the company would receive a working forecasting tool with a short guide, and a presentation of the results to your management. The tool would be built from your own records and would stay with you.</w:t>
+        <w:t>If the study proves useful, the company would receive a working tool built around the chosen problem, with a short guide, and a presentation of the results to your management. The tool would be built from your own records and would stay with you.</w:t>
       </w:r>
     </w:p>
     <w:p>

</xml_diff>